<commit_message>
--Thực Hiện LAB04-- + File word: Nhiệm vụ (1),(2) + UML.draw.io (vẽ sơ đồ [9 sơ đồ]) ✓ có database (gổm: 7 bảng và 3 sản phẩm mẫu) ✓ có C# WinForms (.NET Framework 4.7.2) hoàn chỉnh thông suốt từ (1) nghiệp vụ --> (2) sơ đồ -> (3) CSDL -> (4) kiểm thử
</commit_message>
<xml_diff>
--- a/LAB_AT_OOSD/LAB04/e-Shopping/e-shopping(sodo).docx
+++ b/LAB_AT_OOSD/LAB04/e-Shopping/e-shopping(sodo).docx
@@ -33,8 +33,16 @@
           <w:ilvl w:val="0"/>
           <w:numId w:val="1"/>
         </w:numPr>
-      </w:pPr>
-      <w:r>
+        <w:rPr>
+          <w:b/>
+          <w:bCs/>
+        </w:rPr>
+      </w:pPr>
+      <w:r>
+        <w:rPr>
+          <w:b/>
+          <w:bCs/>
+        </w:rPr>
         <w:t>Giới thiệu</w:t>
       </w:r>
     </w:p>
@@ -92,8 +100,16 @@
           <w:ilvl w:val="0"/>
           <w:numId w:val="3"/>
         </w:numPr>
-      </w:pPr>
-      <w:r>
+        <w:rPr>
+          <w:b/>
+          <w:bCs/>
+        </w:rPr>
+      </w:pPr>
+      <w:r>
+        <w:rPr>
+          <w:b/>
+          <w:bCs/>
+        </w:rPr>
         <w:t>Phạm vi hệ thống</w:t>
       </w:r>
     </w:p>
@@ -338,8 +354,16 @@
           <w:ilvl w:val="0"/>
           <w:numId w:val="6"/>
         </w:numPr>
-      </w:pPr>
-      <w:r>
+        <w:rPr>
+          <w:b/>
+          <w:bCs/>
+        </w:rPr>
+      </w:pPr>
+      <w:r>
+        <w:rPr>
+          <w:b/>
+          <w:bCs/>
+        </w:rPr>
         <w:t>Các tác nhân tham gia</w:t>
       </w:r>
     </w:p>
@@ -648,8 +672,16 @@
           <w:ilvl w:val="0"/>
           <w:numId w:val="10"/>
         </w:numPr>
-      </w:pPr>
-      <w:r>
+        <w:rPr>
+          <w:b/>
+          <w:bCs/>
+        </w:rPr>
+      </w:pPr>
+      <w:r>
+        <w:rPr>
+          <w:b/>
+          <w:bCs/>
+        </w:rPr>
         <w:t>Phân biệt trách nhiệm giữa các hệ thống</w:t>
       </w:r>
     </w:p>
@@ -999,8 +1031,16 @@
           <w:ilvl w:val="0"/>
           <w:numId w:val="11"/>
         </w:numPr>
-      </w:pPr>
-      <w:r>
+        <w:rPr>
+          <w:b/>
+          <w:bCs/>
+        </w:rPr>
+      </w:pPr>
+      <w:r>
+        <w:rPr>
+          <w:b/>
+          <w:bCs/>
+        </w:rPr>
         <w:t>Quy trình nghiệp vụ chính</w:t>
       </w:r>
     </w:p>
@@ -1675,8 +1715,16 @@
           <w:ilvl w:val="0"/>
           <w:numId w:val="19"/>
         </w:numPr>
-      </w:pPr>
-      <w:r>
+        <w:rPr>
+          <w:b/>
+          <w:bCs/>
+        </w:rPr>
+      </w:pPr>
+      <w:r>
+        <w:rPr>
+          <w:b/>
+          <w:bCs/>
+        </w:rPr>
         <w:t>Các quy tắc nghiệp vụ</w:t>
       </w:r>
     </w:p>
@@ -1762,8 +1810,16 @@
           <w:ilvl w:val="0"/>
           <w:numId w:val="20"/>
         </w:numPr>
-      </w:pPr>
-      <w:r>
+        <w:rPr>
+          <w:b/>
+          <w:bCs/>
+        </w:rPr>
+      </w:pPr>
+      <w:r>
+        <w:rPr>
+          <w:b/>
+          <w:bCs/>
+        </w:rPr>
         <w:t>Dữ liệu nghiệp vụ chính</w:t>
       </w:r>
     </w:p>
@@ -2255,8 +2311,21 @@
           <w:ilvl w:val="0"/>
           <w:numId w:val="26"/>
         </w:numPr>
-      </w:pPr>
-      <w:r>
+        <w:tabs>
+          <w:tab w:val="clear" w:pos="720"/>
+          <w:tab w:val="num" w:pos="360"/>
+        </w:tabs>
+        <w:ind w:hanging="720"/>
+        <w:rPr>
+          <w:b/>
+          <w:bCs/>
+        </w:rPr>
+      </w:pPr>
+      <w:r>
+        <w:rPr>
+          <w:b/>
+          <w:bCs/>
+        </w:rPr>
         <w:t>Các luồng ngoại lệ cơ bản</w:t>
       </w:r>
     </w:p>
@@ -2336,8 +2405,21 @@
           <w:ilvl w:val="0"/>
           <w:numId w:val="27"/>
         </w:numPr>
-      </w:pPr>
-      <w:r>
+        <w:tabs>
+          <w:tab w:val="clear" w:pos="720"/>
+          <w:tab w:val="num" w:pos="270"/>
+        </w:tabs>
+        <w:ind w:left="450" w:hanging="450"/>
+        <w:rPr>
+          <w:b/>
+          <w:bCs/>
+        </w:rPr>
+      </w:pPr>
+      <w:r>
+        <w:rPr>
+          <w:b/>
+          <w:bCs/>
+        </w:rPr>
         <w:lastRenderedPageBreak/>
         <w:t>Yêu cầu phi chức năng cơ bản</w:t>
       </w:r>
@@ -2408,8 +2490,21 @@
           <w:ilvl w:val="0"/>
           <w:numId w:val="28"/>
         </w:numPr>
-      </w:pPr>
-      <w:r>
+        <w:tabs>
+          <w:tab w:val="clear" w:pos="720"/>
+          <w:tab w:val="num" w:pos="450"/>
+        </w:tabs>
+        <w:ind w:left="450" w:hanging="450"/>
+        <w:rPr>
+          <w:b/>
+          <w:bCs/>
+        </w:rPr>
+      </w:pPr>
+      <w:r>
+        <w:rPr>
+          <w:b/>
+          <w:bCs/>
+        </w:rPr>
         <w:t>Các điểm chưa được mô tả rõ trong đề bài</w:t>
       </w:r>
     </w:p>
@@ -2562,8 +2657,21 @@
           <w:ilvl w:val="0"/>
           <w:numId w:val="30"/>
         </w:numPr>
-      </w:pPr>
-      <w:r>
+        <w:tabs>
+          <w:tab w:val="clear" w:pos="720"/>
+          <w:tab w:val="num" w:pos="270"/>
+        </w:tabs>
+        <w:ind w:left="450" w:hanging="450"/>
+        <w:rPr>
+          <w:b/>
+          <w:bCs/>
+        </w:rPr>
+      </w:pPr>
+      <w:r>
+        <w:rPr>
+          <w:b/>
+          <w:bCs/>
+        </w:rPr>
         <w:t>Kết luận pha phân tích nghiệp vụ</w:t>
       </w:r>
     </w:p>
@@ -2632,29 +2740,7 @@
           <w:sz w:val="32"/>
           <w:szCs w:val="28"/>
         </w:rPr>
-        <w:t>II</w:t>
-      </w:r>
-      <w:r>
-        <w:rPr>
-          <w:b/>
-          <w:bCs/>
-          <w:sz w:val="32"/>
-          <w:szCs w:val="28"/>
-        </w:rPr>
-        <w:t>. Xây dựng các mô hình UML</w:t>
-      </w:r>
-    </w:p>
-    <w:p>
-      <w:pPr>
-        <w:rPr>
-          <w:lang w:val="vi-VN"/>
-        </w:rPr>
-      </w:pPr>
-      <w:r>
-        <w:rPr>
-          <w:lang w:val="vi-VN"/>
-        </w:rPr>
-        <w:t>II. XÂY DỰNG CÁC MÔ HÌNH UML</w:t>
+        <w:t>II. Xây dựng các mô hình UML</w:t>
       </w:r>
     </w:p>
     <w:p>
@@ -2834,28 +2920,18 @@
     </w:p>
     <w:tbl>
       <w:tblPr>
+        <w:tblStyle w:val="TableGrid"/>
         <w:tblW w:w="0" w:type="auto"/>
-        <w:tblCellSpacing w:w="15" w:type="dxa"/>
-        <w:tblCellMar>
-          <w:top w:w="15" w:type="dxa"/>
-          <w:left w:w="15" w:type="dxa"/>
-          <w:bottom w:w="15" w:type="dxa"/>
-          <w:right w:w="15" w:type="dxa"/>
-        </w:tblCellMar>
         <w:tblLook w:val="04A0" w:firstRow="1" w:lastRow="0" w:firstColumn="1" w:lastColumn="0" w:noHBand="0" w:noVBand="1"/>
       </w:tblPr>
       <w:tblGrid>
-        <w:gridCol w:w="2735"/>
-        <w:gridCol w:w="6670"/>
+        <w:gridCol w:w="2804"/>
+        <w:gridCol w:w="6591"/>
       </w:tblGrid>
       <w:tr>
-        <w:trPr>
-          <w:tblCellSpacing w:w="15" w:type="dxa"/>
-        </w:trPr>
         <w:tc>
           <w:tcPr>
             <w:tcW w:w="0" w:type="auto"/>
-            <w:vAlign w:val="center"/>
             <w:hideMark/>
           </w:tcPr>
           <w:p>
@@ -2877,7 +2953,6 @@
         <w:tc>
           <w:tcPr>
             <w:tcW w:w="0" w:type="auto"/>
-            <w:vAlign w:val="center"/>
             <w:hideMark/>
           </w:tcPr>
           <w:p>
@@ -2898,13 +2973,9 @@
         </w:tc>
       </w:tr>
       <w:tr>
-        <w:trPr>
-          <w:tblCellSpacing w:w="15" w:type="dxa"/>
-        </w:trPr>
         <w:tc>
           <w:tcPr>
             <w:tcW w:w="0" w:type="auto"/>
-            <w:vAlign w:val="center"/>
             <w:hideMark/>
           </w:tcPr>
           <w:p>
@@ -2916,7 +2987,6 @@
         <w:tc>
           <w:tcPr>
             <w:tcW w:w="0" w:type="auto"/>
-            <w:vAlign w:val="center"/>
             <w:hideMark/>
           </w:tcPr>
           <w:p>
@@ -2927,13 +2997,9 @@
         </w:tc>
       </w:tr>
       <w:tr>
-        <w:trPr>
-          <w:tblCellSpacing w:w="15" w:type="dxa"/>
-        </w:trPr>
         <w:tc>
           <w:tcPr>
             <w:tcW w:w="0" w:type="auto"/>
-            <w:vAlign w:val="center"/>
             <w:hideMark/>
           </w:tcPr>
           <w:p>
@@ -2945,7 +3011,6 @@
         <w:tc>
           <w:tcPr>
             <w:tcW w:w="0" w:type="auto"/>
-            <w:vAlign w:val="center"/>
             <w:hideMark/>
           </w:tcPr>
           <w:p>
@@ -2956,13 +3021,9 @@
         </w:tc>
       </w:tr>
       <w:tr>
-        <w:trPr>
-          <w:tblCellSpacing w:w="15" w:type="dxa"/>
-        </w:trPr>
         <w:tc>
           <w:tcPr>
             <w:tcW w:w="0" w:type="auto"/>
-            <w:vAlign w:val="center"/>
             <w:hideMark/>
           </w:tcPr>
           <w:p>
@@ -2974,7 +3035,6 @@
         <w:tc>
           <w:tcPr>
             <w:tcW w:w="0" w:type="auto"/>
-            <w:vAlign w:val="center"/>
             <w:hideMark/>
           </w:tcPr>
           <w:p>
@@ -2985,13 +3045,9 @@
         </w:tc>
       </w:tr>
       <w:tr>
-        <w:trPr>
-          <w:tblCellSpacing w:w="15" w:type="dxa"/>
-        </w:trPr>
         <w:tc>
           <w:tcPr>
             <w:tcW w:w="0" w:type="auto"/>
-            <w:vAlign w:val="center"/>
             <w:hideMark/>
           </w:tcPr>
           <w:p>
@@ -3003,7 +3059,6 @@
         <w:tc>
           <w:tcPr>
             <w:tcW w:w="0" w:type="auto"/>
-            <w:vAlign w:val="center"/>
             <w:hideMark/>
           </w:tcPr>
           <w:p>
@@ -3026,29 +3081,19 @@
     </w:p>
     <w:tbl>
       <w:tblPr>
+        <w:tblStyle w:val="TableGrid"/>
         <w:tblW w:w="0" w:type="auto"/>
-        <w:tblCellSpacing w:w="15" w:type="dxa"/>
-        <w:tblCellMar>
-          <w:top w:w="15" w:type="dxa"/>
-          <w:left w:w="15" w:type="dxa"/>
-          <w:bottom w:w="15" w:type="dxa"/>
-          <w:right w:w="15" w:type="dxa"/>
-        </w:tblCellMar>
         <w:tblLook w:val="04A0" w:firstRow="1" w:lastRow="0" w:firstColumn="1" w:lastColumn="0" w:noHBand="0" w:noVBand="1"/>
       </w:tblPr>
       <w:tblGrid>
-        <w:gridCol w:w="729"/>
-        <w:gridCol w:w="3029"/>
-        <w:gridCol w:w="5647"/>
+        <w:gridCol w:w="870"/>
+        <w:gridCol w:w="3052"/>
+        <w:gridCol w:w="5473"/>
       </w:tblGrid>
       <w:tr>
-        <w:trPr>
-          <w:tblCellSpacing w:w="15" w:type="dxa"/>
-        </w:trPr>
         <w:tc>
           <w:tcPr>
             <w:tcW w:w="0" w:type="auto"/>
-            <w:vAlign w:val="center"/>
             <w:hideMark/>
           </w:tcPr>
           <w:p>
@@ -3070,7 +3115,6 @@
         <w:tc>
           <w:tcPr>
             <w:tcW w:w="0" w:type="auto"/>
-            <w:vAlign w:val="center"/>
             <w:hideMark/>
           </w:tcPr>
           <w:p>
@@ -3092,7 +3136,6 @@
         <w:tc>
           <w:tcPr>
             <w:tcW w:w="0" w:type="auto"/>
-            <w:vAlign w:val="center"/>
             <w:hideMark/>
           </w:tcPr>
           <w:p>
@@ -3113,13 +3156,9 @@
         </w:tc>
       </w:tr>
       <w:tr>
-        <w:trPr>
-          <w:tblCellSpacing w:w="15" w:type="dxa"/>
-        </w:trPr>
         <w:tc>
           <w:tcPr>
             <w:tcW w:w="0" w:type="auto"/>
-            <w:vAlign w:val="center"/>
             <w:hideMark/>
           </w:tcPr>
           <w:p>
@@ -3131,7 +3170,6 @@
         <w:tc>
           <w:tcPr>
             <w:tcW w:w="0" w:type="auto"/>
-            <w:vAlign w:val="center"/>
             <w:hideMark/>
           </w:tcPr>
           <w:p>
@@ -3143,7 +3181,6 @@
         <w:tc>
           <w:tcPr>
             <w:tcW w:w="0" w:type="auto"/>
-            <w:vAlign w:val="center"/>
             <w:hideMark/>
           </w:tcPr>
           <w:p>
@@ -3154,18 +3191,13 @@
         </w:tc>
       </w:tr>
       <w:tr>
-        <w:trPr>
-          <w:tblCellSpacing w:w="15" w:type="dxa"/>
-        </w:trPr>
         <w:tc>
           <w:tcPr>
             <w:tcW w:w="0" w:type="auto"/>
-            <w:vAlign w:val="center"/>
             <w:hideMark/>
           </w:tcPr>
           <w:p>
             <w:r>
-              <w:lastRenderedPageBreak/>
               <w:t>TH02</w:t>
             </w:r>
           </w:p>
@@ -3173,7 +3205,6 @@
         <w:tc>
           <w:tcPr>
             <w:tcW w:w="0" w:type="auto"/>
-            <w:vAlign w:val="center"/>
             <w:hideMark/>
           </w:tcPr>
           <w:p>
@@ -3185,7 +3216,6 @@
         <w:tc>
           <w:tcPr>
             <w:tcW w:w="0" w:type="auto"/>
-            <w:vAlign w:val="center"/>
             <w:hideMark/>
           </w:tcPr>
           <w:p>
@@ -3196,13 +3226,9 @@
         </w:tc>
       </w:tr>
       <w:tr>
-        <w:trPr>
-          <w:tblCellSpacing w:w="15" w:type="dxa"/>
-        </w:trPr>
         <w:tc>
           <w:tcPr>
             <w:tcW w:w="0" w:type="auto"/>
-            <w:vAlign w:val="center"/>
             <w:hideMark/>
           </w:tcPr>
           <w:p>
@@ -3214,7 +3240,6 @@
         <w:tc>
           <w:tcPr>
             <w:tcW w:w="0" w:type="auto"/>
-            <w:vAlign w:val="center"/>
             <w:hideMark/>
           </w:tcPr>
           <w:p>
@@ -3226,7 +3251,6 @@
         <w:tc>
           <w:tcPr>
             <w:tcW w:w="0" w:type="auto"/>
-            <w:vAlign w:val="center"/>
             <w:hideMark/>
           </w:tcPr>
           <w:p>
@@ -3237,13 +3261,9 @@
         </w:tc>
       </w:tr>
       <w:tr>
-        <w:trPr>
-          <w:tblCellSpacing w:w="15" w:type="dxa"/>
-        </w:trPr>
         <w:tc>
           <w:tcPr>
             <w:tcW w:w="0" w:type="auto"/>
-            <w:vAlign w:val="center"/>
             <w:hideMark/>
           </w:tcPr>
           <w:p>
@@ -3255,7 +3275,6 @@
         <w:tc>
           <w:tcPr>
             <w:tcW w:w="0" w:type="auto"/>
-            <w:vAlign w:val="center"/>
             <w:hideMark/>
           </w:tcPr>
           <w:p>
@@ -3267,7 +3286,6 @@
         <w:tc>
           <w:tcPr>
             <w:tcW w:w="0" w:type="auto"/>
-            <w:vAlign w:val="center"/>
             <w:hideMark/>
           </w:tcPr>
           <w:p>
@@ -3278,13 +3296,9 @@
         </w:tc>
       </w:tr>
       <w:tr>
-        <w:trPr>
-          <w:tblCellSpacing w:w="15" w:type="dxa"/>
-        </w:trPr>
         <w:tc>
           <w:tcPr>
             <w:tcW w:w="0" w:type="auto"/>
-            <w:vAlign w:val="center"/>
             <w:hideMark/>
           </w:tcPr>
           <w:p>
@@ -3296,7 +3310,6 @@
         <w:tc>
           <w:tcPr>
             <w:tcW w:w="0" w:type="auto"/>
-            <w:vAlign w:val="center"/>
             <w:hideMark/>
           </w:tcPr>
           <w:p>
@@ -3308,7 +3321,6 @@
         <w:tc>
           <w:tcPr>
             <w:tcW w:w="0" w:type="auto"/>
-            <w:vAlign w:val="center"/>
             <w:hideMark/>
           </w:tcPr>
           <w:p>
@@ -3319,17 +3331,14 @@
         </w:tc>
       </w:tr>
       <w:tr>
-        <w:trPr>
-          <w:tblCellSpacing w:w="15" w:type="dxa"/>
-        </w:trPr>
         <w:tc>
           <w:tcPr>
             <w:tcW w:w="0" w:type="auto"/>
-            <w:vAlign w:val="center"/>
             <w:hideMark/>
           </w:tcPr>
           <w:p>
             <w:r>
+              <w:lastRenderedPageBreak/>
               <w:t>TH06</w:t>
             </w:r>
           </w:p>
@@ -3337,7 +3346,6 @@
         <w:tc>
           <w:tcPr>
             <w:tcW w:w="0" w:type="auto"/>
-            <w:vAlign w:val="center"/>
             <w:hideMark/>
           </w:tcPr>
           <w:p>
@@ -3349,7 +3357,6 @@
         <w:tc>
           <w:tcPr>
             <w:tcW w:w="0" w:type="auto"/>
-            <w:vAlign w:val="center"/>
             <w:hideMark/>
           </w:tcPr>
           <w:p>
@@ -3360,13 +3367,9 @@
         </w:tc>
       </w:tr>
       <w:tr>
-        <w:trPr>
-          <w:tblCellSpacing w:w="15" w:type="dxa"/>
-        </w:trPr>
         <w:tc>
           <w:tcPr>
             <w:tcW w:w="0" w:type="auto"/>
-            <w:vAlign w:val="center"/>
             <w:hideMark/>
           </w:tcPr>
           <w:p>
@@ -3378,7 +3381,6 @@
         <w:tc>
           <w:tcPr>
             <w:tcW w:w="0" w:type="auto"/>
-            <w:vAlign w:val="center"/>
             <w:hideMark/>
           </w:tcPr>
           <w:p>
@@ -3390,7 +3392,6 @@
         <w:tc>
           <w:tcPr>
             <w:tcW w:w="0" w:type="auto"/>
-            <w:vAlign w:val="center"/>
             <w:hideMark/>
           </w:tcPr>
           <w:p>
@@ -3402,12 +3403,16 @@
       </w:tr>
     </w:tbl>
     <w:p>
+      <w:pPr>
+        <w:spacing w:before="240" w:line="360" w:lineRule="auto"/>
+        <w:jc w:val="center"/>
+      </w:pPr>
       <w:r>
         <w:drawing>
-          <wp:inline distT="0" distB="0" distL="0" distR="0" wp14:anchorId="46ED1898" wp14:editId="10D5662C">
-            <wp:extent cx="5972175" cy="3653790"/>
-            <wp:effectExtent l="0" t="0" r="9525" b="3810"/>
-            <wp:docPr id="2112914487" name="Picture 1"/>
+          <wp:inline distT="0" distB="0" distL="0" distR="0" wp14:anchorId="04E30E77" wp14:editId="02558A59">
+            <wp:extent cx="5972175" cy="4221480"/>
+            <wp:effectExtent l="0" t="0" r="9525" b="7620"/>
+            <wp:docPr id="525294734" name="Picture 1"/>
             <wp:cNvGraphicFramePr>
               <a:graphicFrameLocks xmlns:a="http://schemas.openxmlformats.org/drawingml/2006/main" noChangeAspect="1"/>
             </wp:cNvGraphicFramePr>
@@ -3415,7 +3420,7 @@
               <a:graphicData uri="http://schemas.openxmlformats.org/drawingml/2006/picture">
                 <pic:pic xmlns:pic="http://schemas.openxmlformats.org/drawingml/2006/picture">
                   <pic:nvPicPr>
-                    <pic:cNvPr id="2112914487" name=""/>
+                    <pic:cNvPr id="525294734" name=""/>
                     <pic:cNvPicPr/>
                   </pic:nvPicPr>
                   <pic:blipFill>
@@ -3427,7 +3432,7 @@
                   <pic:spPr>
                     <a:xfrm>
                       <a:off x="0" y="0"/>
-                      <a:ext cx="5972175" cy="3653790"/>
+                      <a:ext cx="5972175" cy="4221480"/>
                     </a:xfrm>
                     <a:prstGeom prst="rect">
                       <a:avLst/>
@@ -3440,41 +3445,36 @@
         </w:drawing>
       </w:r>
       <w:r>
-        <w:t xml:space="preserve"> </w:t>
-      </w:r>
-      <w:r>
-        <w:t xml:space="preserve"> </w:t>
-      </w:r>
-      <w:r>
+        <w:rPr>
+          <w:i/>
+          <w:iCs/>
+        </w:rPr>
         <w:t>Hình 2.1. Sơ đồ trường hợp sử dụng tổng quát của hệ thống e-SHOPPING</w:t>
       </w:r>
     </w:p>
     <w:p>
       <w:r>
-        <w:t xml:space="preserve">Sơ đồ thể hiện khách hàng là tác nhân chính tương tác với toàn bộ chức năng bên trong e-SHOPPING. Hệ thống quản lý sản phẩm chỉ tham gia khi hệ thống cần lấy </w:t>
-      </w:r>
+        <w:t>Sơ đồ thể hiện khách hàng là tác nhân chính tương tác với toàn bộ chức năng bên trong e-SHOPPING. Hệ thống quản lý sản phẩm chỉ tham gia khi hệ thống cần lấy dữ liệu sản phẩm. Dịch vụ thanh toán trực tuyến tham gia vào quá trình thanh toán, còn dịch vụ thư điện tử thực hiện việc chuyển thư xác nhận đơn hàng.</w:t>
+      </w:r>
+    </w:p>
+    <w:p>
+      <w:r>
+        <w:t>Ba hệ thống hỗ trợ được đặt bên ngoài biên e-SHOPPING. Cách biểu diễn này giúp phân biệt rõ chức năng do e-SHOPPING quản lý với chức năng do hệ thống bên ngoài thực hiện.</w:t>
+      </w:r>
+    </w:p>
+    <w:p>
+      <w:r>
+        <w:t>2.3. Mô hình lớp phân tích</w:t>
+      </w:r>
+    </w:p>
+    <w:p>
+      <w:r>
+        <w:t>Mô hình lớp phân tích được xây dựng theo ba nhóm lớp cơ bản: lớp biên, lớp điều khiển và lớp thực thể.</w:t>
+      </w:r>
+    </w:p>
+    <w:p>
       <w:r>
         <w:lastRenderedPageBreak/>
-        <w:t>dữ liệu sản phẩm. Dịch vụ thanh toán trực tuyến tham gia vào quá trình thanh toán, còn dịch vụ thư điện tử thực hiện việc chuyển thư xác nhận đơn hàng.</w:t>
-      </w:r>
-    </w:p>
-    <w:p>
-      <w:r>
-        <w:t>Ba hệ thống hỗ trợ được đặt bên ngoài biên e-SHOPPING. Cách biểu diễn này giúp phân biệt rõ chức năng do e-SHOPPING quản lý với chức năng do hệ thống bên ngoài thực hiện.</w:t>
-      </w:r>
-    </w:p>
-    <w:p>
-      <w:r>
-        <w:t>2.3. Mô hình lớp phân tích</w:t>
-      </w:r>
-    </w:p>
-    <w:p>
-      <w:r>
-        <w:t>Mô hình lớp phân tích được xây dựng theo ba nhóm lớp cơ bản: lớp biên, lớp điều khiển và lớp thực thể.</w:t>
-      </w:r>
-    </w:p>
-    <w:p>
-      <w:r>
         <w:t>Lớp biên chịu trách nhiệm tiếp nhận thao tác từ khách hàng. Lớp điều khiển thực hiện các quy tắc và điều phối quá trình xử lý. Lớp thực thể đại diện cho các thông tin nghiệp vụ cần quản lý.</w:t>
       </w:r>
     </w:p>
@@ -3577,13 +3577,16 @@
       </w:r>
     </w:p>
     <w:p>
+      <w:pPr>
+        <w:spacing w:before="240" w:line="360" w:lineRule="auto"/>
+      </w:pPr>
       <w:r>
         <w:lastRenderedPageBreak/>
         <w:drawing>
-          <wp:inline distT="0" distB="0" distL="0" distR="0" wp14:anchorId="15CF4FCD" wp14:editId="78BEDDB2">
-            <wp:extent cx="5972175" cy="2731770"/>
-            <wp:effectExtent l="0" t="0" r="9525" b="0"/>
-            <wp:docPr id="1479047114" name="Picture 1"/>
+          <wp:inline distT="0" distB="0" distL="0" distR="0" wp14:anchorId="6C79DC32" wp14:editId="274DCC85">
+            <wp:extent cx="5972175" cy="4242435"/>
+            <wp:effectExtent l="0" t="0" r="9525" b="5715"/>
+            <wp:docPr id="1160460922" name="Picture 1"/>
             <wp:cNvGraphicFramePr>
               <a:graphicFrameLocks xmlns:a="http://schemas.openxmlformats.org/drawingml/2006/main" noChangeAspect="1"/>
             </wp:cNvGraphicFramePr>
@@ -3591,11 +3594,182 @@
               <a:graphicData uri="http://schemas.openxmlformats.org/drawingml/2006/picture">
                 <pic:pic xmlns:pic="http://schemas.openxmlformats.org/drawingml/2006/picture">
                   <pic:nvPicPr>
-                    <pic:cNvPr id="1479047114" name=""/>
+                    <pic:cNvPr id="1160460922" name=""/>
                     <pic:cNvPicPr/>
                   </pic:nvPicPr>
                   <pic:blipFill>
                     <a:blip r:embed="rId7"/>
+                    <a:stretch>
+                      <a:fillRect/>
+                    </a:stretch>
+                  </pic:blipFill>
+                  <pic:spPr>
+                    <a:xfrm>
+                      <a:off x="0" y="0"/>
+                      <a:ext cx="5972175" cy="4242435"/>
+                    </a:xfrm>
+                    <a:prstGeom prst="rect">
+                      <a:avLst/>
+                    </a:prstGeom>
+                  </pic:spPr>
+                </pic:pic>
+              </a:graphicData>
+            </a:graphic>
+          </wp:inline>
+        </w:drawing>
+      </w:r>
+    </w:p>
+    <w:p>
+      <w:pPr>
+        <w:jc w:val="center"/>
+        <w:rPr>
+          <w:i/>
+          <w:iCs/>
+        </w:rPr>
+      </w:pPr>
+      <w:r>
+        <w:rPr>
+          <w:i/>
+          <w:iCs/>
+        </w:rPr>
+        <w:t>Hình 2.2. Sơ đồ lớp phân tích của hệ thống e-SHOPPING</w:t>
+      </w:r>
+    </w:p>
+    <w:p>
+      <w:r>
+        <w:t>Giao diện mua hàng tiếp nhận yêu cầu xem sản phẩm, quản lý giỏ hàng và đặt hàng. Các yêu cầu này được chuyển đến lớp Điều khiển mua hàng để xử lý.</w:t>
+      </w:r>
+    </w:p>
+    <w:p>
+      <w:r>
+        <w:t>Giao diện tài khoản tiếp nhận thông tin đăng nhập hoặc đăng ký và chuyển cho lớp Điều khiển tài khoản. Lớp điều khiển này kiểm tra và cập nhật thông tin khách hàng.</w:t>
+      </w:r>
+    </w:p>
+    <w:p>
+      <w:r>
+        <w:t>Điều khiển mua hàng sử dụng các thực thể Sản phẩm, Giỏ hàng và Đơn hàng. Khi cần lấy dữ liệu sản phẩm, xử lý thanh toán hoặc gửi thư, lớp điều khiển gửi yêu cầu đến hệ thống bên ngoài tương ứng.</w:t>
+      </w:r>
+    </w:p>
+    <w:p>
+      <w:r>
+        <w:t>2.4. Mô hình trạng thái</w:t>
+      </w:r>
+    </w:p>
+    <w:p>
+      <w:r>
+        <w:t>Mô hình trạng thái mô tả sự thay đổi trạng thái của quá trình đặt hàng từ lúc khách hàng đang chọn sản phẩm đến khi đơn hàng hoàn tất.</w:t>
+      </w:r>
+    </w:p>
+    <w:p>
+      <w:r>
+        <w:t>Các trạng thái chính gồm:</w:t>
+      </w:r>
+    </w:p>
+    <w:p>
+      <w:pPr>
+        <w:numPr>
+          <w:ilvl w:val="0"/>
+          <w:numId w:val="34"/>
+        </w:numPr>
+      </w:pPr>
+      <w:r>
+        <w:t>Đang chọn hàng.</w:t>
+      </w:r>
+    </w:p>
+    <w:p>
+      <w:pPr>
+        <w:numPr>
+          <w:ilvl w:val="0"/>
+          <w:numId w:val="34"/>
+        </w:numPr>
+      </w:pPr>
+      <w:r>
+        <w:lastRenderedPageBreak/>
+        <w:t>Chờ thông tin đặt hàng.</w:t>
+      </w:r>
+    </w:p>
+    <w:p>
+      <w:pPr>
+        <w:numPr>
+          <w:ilvl w:val="0"/>
+          <w:numId w:val="34"/>
+        </w:numPr>
+      </w:pPr>
+      <w:r>
+        <w:t>Đang xử lý thanh toán.</w:t>
+      </w:r>
+    </w:p>
+    <w:p>
+      <w:pPr>
+        <w:numPr>
+          <w:ilvl w:val="0"/>
+          <w:numId w:val="34"/>
+        </w:numPr>
+      </w:pPr>
+      <w:r>
+        <w:t>Thanh toán thất bại.</w:t>
+      </w:r>
+    </w:p>
+    <w:p>
+      <w:pPr>
+        <w:numPr>
+          <w:ilvl w:val="0"/>
+          <w:numId w:val="34"/>
+        </w:numPr>
+      </w:pPr>
+      <w:r>
+        <w:t>Đã ghi nhận đơn hàng.</w:t>
+      </w:r>
+    </w:p>
+    <w:p>
+      <w:pPr>
+        <w:numPr>
+          <w:ilvl w:val="0"/>
+          <w:numId w:val="34"/>
+        </w:numPr>
+      </w:pPr>
+      <w:r>
+        <w:t>Đang gửi thư xác nhận.</w:t>
+      </w:r>
+    </w:p>
+    <w:p>
+      <w:pPr>
+        <w:numPr>
+          <w:ilvl w:val="0"/>
+          <w:numId w:val="34"/>
+        </w:numPr>
+      </w:pPr>
+      <w:r>
+        <w:t>Hoàn tất.</w:t>
+      </w:r>
+    </w:p>
+    <w:p>
+      <w:pPr>
+        <w:spacing w:before="240" w:line="360" w:lineRule="auto"/>
+        <w:jc w:val="center"/>
+        <w:rPr>
+          <w:i/>
+          <w:iCs/>
+        </w:rPr>
+      </w:pPr>
+      <w:r>
+        <w:drawing>
+          <wp:inline distT="0" distB="0" distL="0" distR="0" wp14:anchorId="2887288F" wp14:editId="75997DEF">
+            <wp:extent cx="5972175" cy="2731770"/>
+            <wp:effectExtent l="0" t="0" r="9525" b="0"/>
+            <wp:docPr id="1996380115" name="Picture 1"/>
+            <wp:cNvGraphicFramePr>
+              <a:graphicFrameLocks xmlns:a="http://schemas.openxmlformats.org/drawingml/2006/main" noChangeAspect="1"/>
+            </wp:cNvGraphicFramePr>
+            <a:graphic xmlns:a="http://schemas.openxmlformats.org/drawingml/2006/main">
+              <a:graphicData uri="http://schemas.openxmlformats.org/drawingml/2006/picture">
+                <pic:pic xmlns:pic="http://schemas.openxmlformats.org/drawingml/2006/picture">
+                  <pic:nvPicPr>
+                    <pic:cNvPr id="1996380115" name=""/>
+                    <pic:cNvPicPr/>
+                  </pic:nvPicPr>
+                  <pic:blipFill>
+                    <a:blip r:embed="rId8"/>
                     <a:stretch>
                       <a:fillRect/>
                     </a:stretch>
@@ -3615,187 +3789,37 @@
           </wp:inline>
         </w:drawing>
       </w:r>
-    </w:p>
-    <w:p>
-      <w:r>
-        <w:t>Hình 2.2. Sơ đồ lớp phân tích của hệ thống e-SHOPPING</w:t>
-      </w:r>
-    </w:p>
-    <w:p>
-      <w:r>
-        <w:t>Giao diện mua hàng tiếp nhận yêu cầu xem sản phẩm, quản lý giỏ hàng và đặt hàng. Các yêu cầu này được chuyển đến lớp Điều khiển mua hàng để xử lý.</w:t>
-      </w:r>
-    </w:p>
-    <w:p>
-      <w:r>
-        <w:t>Giao diện tài khoản tiếp nhận thông tin đăng nhập hoặc đăng ký và chuyển cho lớp Điều khiển tài khoản. Lớp điều khiển này kiểm tra và cập nhật thông tin khách hàng.</w:t>
-      </w:r>
-    </w:p>
-    <w:p>
-      <w:r>
-        <w:t>Điều khiển mua hàng sử dụng các thực thể Sản phẩm, Giỏ hàng và Đơn hàng. Khi cần lấy dữ liệu sản phẩm, xử lý thanh toán hoặc gửi thư, lớp điều khiển gửi yêu cầu đến hệ thống bên ngoài tương ứng.</w:t>
-      </w:r>
-    </w:p>
-    <w:p>
-      <w:r>
-        <w:t>2.4. Mô hình trạng thái</w:t>
-      </w:r>
-    </w:p>
-    <w:p>
-      <w:r>
-        <w:t>Mô hình trạng thái mô tả sự thay đổi trạng thái của quá trình đặt hàng từ lúc khách hàng đang chọn sản phẩm đến khi đơn hàng hoàn tất.</w:t>
-      </w:r>
-    </w:p>
-    <w:p>
-      <w:r>
-        <w:t>Các trạng thái chính gồm:</w:t>
-      </w:r>
-    </w:p>
-    <w:p>
-      <w:pPr>
-        <w:numPr>
-          <w:ilvl w:val="0"/>
-          <w:numId w:val="34"/>
-        </w:numPr>
-      </w:pPr>
-      <w:r>
-        <w:t>Đang chọn hàng.</w:t>
-      </w:r>
-    </w:p>
-    <w:p>
-      <w:pPr>
-        <w:numPr>
-          <w:ilvl w:val="0"/>
-          <w:numId w:val="34"/>
-        </w:numPr>
-      </w:pPr>
-      <w:r>
-        <w:t>Chờ thông tin đặt hàng.</w:t>
-      </w:r>
-    </w:p>
-    <w:p>
-      <w:pPr>
-        <w:numPr>
-          <w:ilvl w:val="0"/>
-          <w:numId w:val="34"/>
-        </w:numPr>
-      </w:pPr>
-      <w:r>
-        <w:t>Đang xử lý thanh toán.</w:t>
-      </w:r>
-    </w:p>
-    <w:p>
-      <w:pPr>
-        <w:numPr>
-          <w:ilvl w:val="0"/>
-          <w:numId w:val="34"/>
-        </w:numPr>
-      </w:pPr>
-      <w:r>
-        <w:t>Thanh toán thất bại.</w:t>
-      </w:r>
-    </w:p>
-    <w:p>
-      <w:pPr>
-        <w:numPr>
-          <w:ilvl w:val="0"/>
-          <w:numId w:val="34"/>
-        </w:numPr>
-      </w:pPr>
-      <w:r>
-        <w:t>Đã ghi nhận đơn hàng.</w:t>
-      </w:r>
-    </w:p>
-    <w:p>
-      <w:pPr>
-        <w:numPr>
-          <w:ilvl w:val="0"/>
-          <w:numId w:val="34"/>
-        </w:numPr>
-      </w:pPr>
-      <w:r>
-        <w:t>Đang gửi thư xác nhận.</w:t>
-      </w:r>
-    </w:p>
-    <w:p>
-      <w:pPr>
-        <w:numPr>
-          <w:ilvl w:val="0"/>
-          <w:numId w:val="34"/>
-        </w:numPr>
-      </w:pPr>
+      <w:r>
+        <w:rPr>
+          <w:i/>
+          <w:iCs/>
+        </w:rPr>
+        <w:t>Hình 2.3. Sơ đồ trạng thái của quá trình đặt hàng</w:t>
+      </w:r>
+    </w:p>
+    <w:p>
+      <w:r>
+        <w:t>Ban đầu, khách hàng lựa chọn sản phẩm và cập nhật giỏ hàng. Khi chọn chức năng tính tiền, quá trình chuyển sang trạng thái chờ thông tin đặt hàng.</w:t>
+      </w:r>
+    </w:p>
+    <w:p>
+      <w:r>
+        <w:t>Sau khi khách hàng cung cấp đầy đủ thông tin, hệ thống gửi yêu cầu thanh toán. Nếu thanh toán thất bại, khách hàng có thể nhập lại thông tin hoặc sử dụng thẻ khác. Nếu thanh toán thành công, hệ thống ghi nhận đơn hàng.</w:t>
+      </w:r>
+    </w:p>
+    <w:p>
+      <w:r>
+        <w:t>Khi khách hàng có địa chỉ thư điện tử, hệ thống yêu cầu gửi thư xác nhận. Việc gửi thư không quyết định tính hợp lệ của đơn hàng. Vì vậy, nếu gửi thư thất bại, đơn hàng vẫn được xem là đã đặt thành công và yêu cầu gửi thư có thể được xử lý lại sau.</w:t>
+      </w:r>
+    </w:p>
+    <w:p>
+      <w:r>
+        <w:t>2.5. Mô hình tuần tự</w:t>
+      </w:r>
+    </w:p>
+    <w:p>
       <w:r>
         <w:lastRenderedPageBreak/>
-        <w:t>Hoàn tất.</w:t>
-      </w:r>
-    </w:p>
-    <w:p>
-      <w:r>
-        <w:drawing>
-          <wp:inline distT="0" distB="0" distL="0" distR="0" wp14:anchorId="2F402FEC" wp14:editId="4C7B2A47">
-            <wp:extent cx="5972175" cy="2752725"/>
-            <wp:effectExtent l="0" t="0" r="9525" b="9525"/>
-            <wp:docPr id="189096849" name="Picture 1"/>
-            <wp:cNvGraphicFramePr>
-              <a:graphicFrameLocks xmlns:a="http://schemas.openxmlformats.org/drawingml/2006/main" noChangeAspect="1"/>
-            </wp:cNvGraphicFramePr>
-            <a:graphic xmlns:a="http://schemas.openxmlformats.org/drawingml/2006/main">
-              <a:graphicData uri="http://schemas.openxmlformats.org/drawingml/2006/picture">
-                <pic:pic xmlns:pic="http://schemas.openxmlformats.org/drawingml/2006/picture">
-                  <pic:nvPicPr>
-                    <pic:cNvPr id="189096849" name=""/>
-                    <pic:cNvPicPr/>
-                  </pic:nvPicPr>
-                  <pic:blipFill>
-                    <a:blip r:embed="rId8"/>
-                    <a:stretch>
-                      <a:fillRect/>
-                    </a:stretch>
-                  </pic:blipFill>
-                  <pic:spPr>
-                    <a:xfrm>
-                      <a:off x="0" y="0"/>
-                      <a:ext cx="5972175" cy="2752725"/>
-                    </a:xfrm>
-                    <a:prstGeom prst="rect">
-                      <a:avLst/>
-                    </a:prstGeom>
-                  </pic:spPr>
-                </pic:pic>
-              </a:graphicData>
-            </a:graphic>
-          </wp:inline>
-        </w:drawing>
-      </w:r>
-      <w:r>
-        <w:t xml:space="preserve"> </w:t>
-      </w:r>
-      <w:r>
-        <w:t>Hình 2.3. Sơ đồ trạng thái của quá trình đặt hàng</w:t>
-      </w:r>
-    </w:p>
-    <w:p>
-      <w:r>
-        <w:t>Ban đầu, khách hàng lựa chọn sản phẩm và cập nhật giỏ hàng. Khi chọn chức năng tính tiền, quá trình chuyển sang trạng thái chờ thông tin đặt hàng.</w:t>
-      </w:r>
-    </w:p>
-    <w:p>
-      <w:r>
-        <w:t>Sau khi khách hàng cung cấp đầy đủ thông tin, hệ thống gửi yêu cầu thanh toán. Nếu thanh toán thất bại, khách hàng có thể nhập lại thông tin hoặc sử dụng thẻ khác. Nếu thanh toán thành công, hệ thống ghi nhận đơn hàng.</w:t>
-      </w:r>
-    </w:p>
-    <w:p>
-      <w:r>
-        <w:t>Khi khách hàng có địa chỉ thư điện tử, hệ thống yêu cầu gửi thư xác nhận. Việc gửi thư không quyết định tính hợp lệ của đơn hàng. Vì vậy, nếu gửi thư thất bại, đơn hàng vẫn được xem là đã đặt thành công và yêu cầu gửi thư có thể được xử lý lại sau.</w:t>
-      </w:r>
-    </w:p>
-    <w:p>
-      <w:r>
-        <w:t>2.5. Mô hình tuần tự</w:t>
-      </w:r>
-    </w:p>
-    <w:p>
-      <w:r>
         <w:t>Mô hình tuần tự được sử dụng để mô tả thứ tự trao đổi thông tin giữa khách hàng, e-SHOPPING và các hệ thống bên ngoài. Hai quy trình được lựa chọn là chọn sản phẩm và đặt hàng.</w:t>
       </w:r>
     </w:p>
@@ -3850,7 +3874,6 @@
         </w:numPr>
       </w:pPr>
       <w:r>
-        <w:lastRenderedPageBreak/>
         <w:t>Hệ thống quản lý sản phẩm.</w:t>
       </w:r>
     </w:p>
@@ -3866,6 +3889,10 @@
       </w:r>
     </w:p>
     <w:p>
+      <w:pPr>
+        <w:spacing w:before="240" w:line="360" w:lineRule="auto"/>
+        <w:jc w:val="center"/>
+      </w:pPr>
       <w:r>
         <w:drawing>
           <wp:inline distT="0" distB="0" distL="0" distR="0" wp14:anchorId="38AC7093" wp14:editId="4A678494">
@@ -3904,9 +3931,10 @@
         </w:drawing>
       </w:r>
       <w:r>
-        <w:t xml:space="preserve"> </w:t>
-      </w:r>
-      <w:r>
+        <w:rPr>
+          <w:i/>
+          <w:iCs/>
+        </w:rPr>
         <w:t>Hình 2.4. Sơ đồ tuần tự chọn sản phẩm và quản lý giỏ hàng</w:t>
       </w:r>
     </w:p>
@@ -3917,6 +3945,7 @@
     </w:p>
     <w:p>
       <w:r>
+        <w:lastRenderedPageBreak/>
         <w:t>Sau khi nhận được dữ liệu, e-SHOPPING hiển thị danh sách cho khách hàng. Khách hàng có thể chọn sản phẩm và số lượng cần mua. Hệ thống thêm sản phẩm vào giỏ hàng, tính lại tiền hàng và hiển thị kết quả.</w:t>
       </w:r>
     </w:p>
@@ -3965,66 +3994,106 @@
         </w:numPr>
       </w:pPr>
       <w:r>
+        <w:t>Bộ phận xử lý đặt hàng.</w:t>
+      </w:r>
+    </w:p>
+    <w:p>
+      <w:pPr>
+        <w:numPr>
+          <w:ilvl w:val="0"/>
+          <w:numId w:val="36"/>
+        </w:numPr>
+      </w:pPr>
+      <w:r>
+        <w:t>Hệ thống quản lý sản phẩm.</w:t>
+      </w:r>
+    </w:p>
+    <w:p>
+      <w:pPr>
+        <w:numPr>
+          <w:ilvl w:val="0"/>
+          <w:numId w:val="36"/>
+        </w:numPr>
+      </w:pPr>
+      <w:r>
+        <w:t>Dịch vụ thanh toán trực tuyến.</w:t>
+      </w:r>
+    </w:p>
+    <w:p>
+      <w:pPr>
+        <w:numPr>
+          <w:ilvl w:val="0"/>
+          <w:numId w:val="36"/>
+        </w:numPr>
+      </w:pPr>
+      <w:r>
+        <w:t>Kho dữ liệu đơn hàng.</w:t>
+      </w:r>
+    </w:p>
+    <w:p>
+      <w:pPr>
+        <w:numPr>
+          <w:ilvl w:val="0"/>
+          <w:numId w:val="36"/>
+        </w:numPr>
+      </w:pPr>
+      <w:r>
+        <w:t>Dịch vụ thư điện tử.</w:t>
+      </w:r>
+    </w:p>
+    <w:p>
+      <w:pPr>
+        <w:spacing w:before="240" w:line="360" w:lineRule="auto"/>
+        <w:jc w:val="center"/>
+      </w:pPr>
+      <w:r>
+        <w:drawing>
+          <wp:inline distT="0" distB="0" distL="0" distR="0" wp14:anchorId="49BB00DE" wp14:editId="44ECFAE4">
+            <wp:extent cx="5972175" cy="3524885"/>
+            <wp:effectExtent l="0" t="0" r="9525" b="0"/>
+            <wp:docPr id="435395994" name="Picture 1"/>
+            <wp:cNvGraphicFramePr>
+              <a:graphicFrameLocks xmlns:a="http://schemas.openxmlformats.org/drawingml/2006/main" noChangeAspect="1"/>
+            </wp:cNvGraphicFramePr>
+            <a:graphic xmlns:a="http://schemas.openxmlformats.org/drawingml/2006/main">
+              <a:graphicData uri="http://schemas.openxmlformats.org/drawingml/2006/picture">
+                <pic:pic xmlns:pic="http://schemas.openxmlformats.org/drawingml/2006/picture">
+                  <pic:nvPicPr>
+                    <pic:cNvPr id="435395994" name=""/>
+                    <pic:cNvPicPr/>
+                  </pic:nvPicPr>
+                  <pic:blipFill>
+                    <a:blip r:embed="rId10"/>
+                    <a:stretch>
+                      <a:fillRect/>
+                    </a:stretch>
+                  </pic:blipFill>
+                  <pic:spPr>
+                    <a:xfrm>
+                      <a:off x="0" y="0"/>
+                      <a:ext cx="5972175" cy="3524885"/>
+                    </a:xfrm>
+                    <a:prstGeom prst="rect">
+                      <a:avLst/>
+                    </a:prstGeom>
+                  </pic:spPr>
+                </pic:pic>
+              </a:graphicData>
+            </a:graphic>
+          </wp:inline>
+        </w:drawing>
+      </w:r>
+      <w:r>
+        <w:rPr>
+          <w:i/>
+          <w:iCs/>
+        </w:rPr>
+        <w:t>Hình 2.5. Sơ đồ tuần tự đặt hàng, thanh toán và gửi thư xác nhận</w:t>
+      </w:r>
+    </w:p>
+    <w:p>
+      <w:r>
         <w:lastRenderedPageBreak/>
-        <w:t>Bộ phận xử lý đặt hàng.</w:t>
-      </w:r>
-    </w:p>
-    <w:p>
-      <w:pPr>
-        <w:numPr>
-          <w:ilvl w:val="0"/>
-          <w:numId w:val="36"/>
-        </w:numPr>
-      </w:pPr>
-      <w:r>
-        <w:t>Hệ thống quản lý sản phẩm.</w:t>
-      </w:r>
-    </w:p>
-    <w:p>
-      <w:pPr>
-        <w:numPr>
-          <w:ilvl w:val="0"/>
-          <w:numId w:val="36"/>
-        </w:numPr>
-      </w:pPr>
-      <w:r>
-        <w:t>Dịch vụ thanh toán trực tuyến.</w:t>
-      </w:r>
-    </w:p>
-    <w:p>
-      <w:pPr>
-        <w:numPr>
-          <w:ilvl w:val="0"/>
-          <w:numId w:val="36"/>
-        </w:numPr>
-      </w:pPr>
-      <w:r>
-        <w:t>Kho dữ liệu đơn hàng.</w:t>
-      </w:r>
-    </w:p>
-    <w:p>
-      <w:pPr>
-        <w:numPr>
-          <w:ilvl w:val="0"/>
-          <w:numId w:val="36"/>
-        </w:numPr>
-      </w:pPr>
-      <w:r>
-        <w:t>Dịch vụ thư điện tử.</w:t>
-      </w:r>
-    </w:p>
-    <w:p>
-      <w:r>
-        <w:t>[CHÈN SƠ ĐỒ TUẦN TỰ ĐẶT HÀNG TẠI ĐÂY]</w:t>
-      </w:r>
-    </w:p>
-    <w:p>
-      <w:r>
-        <w:t>Hình 2.5. Sơ đồ tuần tự đặt hàng, thanh toán và gửi thư xác nhận</w:t>
-      </w:r>
-    </w:p>
-    <w:p>
-      <w:r>
         <w:t>Khách hàng chọn chức năng tính tiền, nhập thông tin người nhận và lựa chọn hình thức giao hàng. Hệ thống tính tiền hàng, phí giao hàng và tổng số tiền cần thanh toán.</w:t>
       </w:r>
     </w:p>
@@ -4115,50 +4184,100 @@
         </w:numPr>
       </w:pPr>
       <w:r>
+        <w:t>Người nhận.</w:t>
+      </w:r>
+    </w:p>
+    <w:p>
+      <w:pPr>
+        <w:numPr>
+          <w:ilvl w:val="0"/>
+          <w:numId w:val="37"/>
+        </w:numPr>
+      </w:pPr>
+      <w:r>
+        <w:t>Đơn hàng.</w:t>
+      </w:r>
+    </w:p>
+    <w:p>
+      <w:pPr>
+        <w:numPr>
+          <w:ilvl w:val="0"/>
+          <w:numId w:val="37"/>
+        </w:numPr>
+      </w:pPr>
+      <w:r>
+        <w:t>Chi tiết đơn hàng.</w:t>
+      </w:r>
+    </w:p>
+    <w:p>
+      <w:pPr>
+        <w:numPr>
+          <w:ilvl w:val="0"/>
+          <w:numId w:val="37"/>
+        </w:numPr>
+      </w:pPr>
+      <w:r>
+        <w:t>Giao dịch thanh toán.</w:t>
+      </w:r>
+    </w:p>
+    <w:p>
+      <w:pPr>
+        <w:spacing w:before="240" w:line="276" w:lineRule="auto"/>
+        <w:jc w:val="center"/>
+      </w:pPr>
+      <w:r>
         <w:lastRenderedPageBreak/>
-        <w:t>Người nhận.</w:t>
-      </w:r>
-    </w:p>
-    <w:p>
-      <w:pPr>
-        <w:numPr>
-          <w:ilvl w:val="0"/>
-          <w:numId w:val="37"/>
-        </w:numPr>
-      </w:pPr>
-      <w:r>
-        <w:t>Đơn hàng.</w:t>
-      </w:r>
-    </w:p>
-    <w:p>
-      <w:pPr>
-        <w:numPr>
-          <w:ilvl w:val="0"/>
-          <w:numId w:val="37"/>
-        </w:numPr>
-      </w:pPr>
-      <w:r>
-        <w:t>Chi tiết đơn hàng.</w:t>
-      </w:r>
-    </w:p>
-    <w:p>
-      <w:pPr>
-        <w:numPr>
-          <w:ilvl w:val="0"/>
-          <w:numId w:val="37"/>
-        </w:numPr>
-      </w:pPr>
-      <w:r>
-        <w:t>Giao dịch thanh toán.</w:t>
-      </w:r>
-    </w:p>
-    <w:p>
-      <w:r>
-        <w:t>[CHÈN SƠ ĐỒ LỚP THIẾT KẾ NGHIỆP VỤ TẠI ĐÂY]</w:t>
-      </w:r>
-    </w:p>
-    <w:p>
-      <w:r>
+        <w:drawing>
+          <wp:inline distT="0" distB="0" distL="0" distR="0" wp14:anchorId="664DD87C" wp14:editId="71D5541F">
+            <wp:extent cx="5972175" cy="3364865"/>
+            <wp:effectExtent l="0" t="0" r="9525" b="6985"/>
+            <wp:docPr id="1000901312" name="Picture 1"/>
+            <wp:cNvGraphicFramePr>
+              <a:graphicFrameLocks xmlns:a="http://schemas.openxmlformats.org/drawingml/2006/main" noChangeAspect="1"/>
+            </wp:cNvGraphicFramePr>
+            <a:graphic xmlns:a="http://schemas.openxmlformats.org/drawingml/2006/main">
+              <a:graphicData uri="http://schemas.openxmlformats.org/drawingml/2006/picture">
+                <pic:pic xmlns:pic="http://schemas.openxmlformats.org/drawingml/2006/picture">
+                  <pic:nvPicPr>
+                    <pic:cNvPr id="1000901312" name=""/>
+                    <pic:cNvPicPr/>
+                  </pic:nvPicPr>
+                  <pic:blipFill>
+                    <a:blip r:embed="rId11"/>
+                    <a:stretch>
+                      <a:fillRect/>
+                    </a:stretch>
+                  </pic:blipFill>
+                  <pic:spPr>
+                    <a:xfrm>
+                      <a:off x="0" y="0"/>
+                      <a:ext cx="5972175" cy="3364865"/>
+                    </a:xfrm>
+                    <a:prstGeom prst="rect">
+                      <a:avLst/>
+                    </a:prstGeom>
+                  </pic:spPr>
+                </pic:pic>
+              </a:graphicData>
+            </a:graphic>
+          </wp:inline>
+        </w:drawing>
+      </w:r>
+    </w:p>
+    <w:p>
+      <w:pPr>
+        <w:spacing w:line="276" w:lineRule="auto"/>
+        <w:jc w:val="center"/>
+        <w:rPr>
+          <w:i/>
+          <w:iCs/>
+        </w:rPr>
+      </w:pPr>
+      <w:r>
+        <w:rPr>
+          <w:i/>
+          <w:iCs/>
+        </w:rPr>
         <w:t>Hình 2.6. Sơ đồ lớp thiết kế nghiệp vụ của hệ thống e-SHOPPING</w:t>
       </w:r>
     </w:p>
@@ -4226,12 +4345,53 @@
       </w:r>
     </w:p>
     <w:p>
-      <w:r>
-        <w:t>[CHÈN SƠ ĐỒ LỚP THIẾT KẾ KỸ THUẬT TẠI ĐÂY]</w:t>
-      </w:r>
-    </w:p>
-    <w:p>
-      <w:r>
+      <w:pPr>
+        <w:spacing w:before="240" w:line="360" w:lineRule="auto"/>
+        <w:jc w:val="center"/>
+      </w:pPr>
+      <w:r>
+        <w:lastRenderedPageBreak/>
+        <w:drawing>
+          <wp:inline distT="0" distB="0" distL="0" distR="0" wp14:anchorId="5408DB0D" wp14:editId="6AB27699">
+            <wp:extent cx="5972175" cy="2942590"/>
+            <wp:effectExtent l="0" t="0" r="9525" b="0"/>
+            <wp:docPr id="1812438686" name="Picture 1"/>
+            <wp:cNvGraphicFramePr>
+              <a:graphicFrameLocks xmlns:a="http://schemas.openxmlformats.org/drawingml/2006/main" noChangeAspect="1"/>
+            </wp:cNvGraphicFramePr>
+            <a:graphic xmlns:a="http://schemas.openxmlformats.org/drawingml/2006/main">
+              <a:graphicData uri="http://schemas.openxmlformats.org/drawingml/2006/picture">
+                <pic:pic xmlns:pic="http://schemas.openxmlformats.org/drawingml/2006/picture">
+                  <pic:nvPicPr>
+                    <pic:cNvPr id="1812438686" name=""/>
+                    <pic:cNvPicPr/>
+                  </pic:nvPicPr>
+                  <pic:blipFill>
+                    <a:blip r:embed="rId12"/>
+                    <a:stretch>
+                      <a:fillRect/>
+                    </a:stretch>
+                  </pic:blipFill>
+                  <pic:spPr>
+                    <a:xfrm>
+                      <a:off x="0" y="0"/>
+                      <a:ext cx="5972175" cy="2942590"/>
+                    </a:xfrm>
+                    <a:prstGeom prst="rect">
+                      <a:avLst/>
+                    </a:prstGeom>
+                  </pic:spPr>
+                </pic:pic>
+              </a:graphicData>
+            </a:graphic>
+          </wp:inline>
+        </w:drawing>
+      </w:r>
+      <w:r>
+        <w:rPr>
+          <w:i/>
+          <w:iCs/>
+        </w:rPr>
         <w:t>Hình 2.7. Sơ đồ lớp thiết kế kỹ thuật của hệ thống e-SHOPPING</w:t>
       </w:r>
     </w:p>
@@ -4242,76 +4402,76 @@
     </w:p>
     <w:p>
       <w:r>
+        <w:t>Nhóm xử lý nghiệp vụ gồm Xử lý sản phẩm, Xử lý giỏ hàng, Xử lý đặt hàng và Xử lý tài khoản. Đây là nơi thực hiện các quy tắc như tính tiền hàng, tính phí giao hàng, kiểm tra điều kiện miễn phí giao hàng và ghi nhận đơn hàng.</w:t>
+      </w:r>
+    </w:p>
+    <w:p>
+      <w:r>
+        <w:t>Nhóm kết nối gồm Kết nối quản lý sản phẩm, Kết nối thanh toán và Kết nối thư điện tử. Mỗi lớp kết nối chỉ phụ trách trao đổi dữ liệu với một hệ thống bên ngoài.</w:t>
+      </w:r>
+    </w:p>
+    <w:p>
+      <w:r>
+        <w:t>Lớp Truy cập cơ sở dữ liệu thực hiện việc đọc và ghi dữ liệu khách hàng, đơn hàng và chi tiết đơn hàng. Cách tổ chức này giúp giao diện, nghiệp vụ và dữ liệu không phụ thuộc trực tiếp vào nhau.</w:t>
+      </w:r>
+    </w:p>
+    <w:p>
+      <w:r>
+        <w:t>2.7. Thiết kế theo chức năng</w:t>
+      </w:r>
+    </w:p>
+    <w:p>
+      <w:r>
+        <w:t>Mô hình thiết kế theo chức năng thể hiện cách các nhóm chức năng của e-SHOPPING được tổ chức trong chương trình.</w:t>
+      </w:r>
+    </w:p>
+    <w:p>
+      <w:r>
+        <w:t>Các chức năng giao diện gồm:</w:t>
+      </w:r>
+    </w:p>
+    <w:p>
+      <w:pPr>
+        <w:numPr>
+          <w:ilvl w:val="0"/>
+          <w:numId w:val="39"/>
+        </w:numPr>
+      </w:pPr>
+      <w:r>
+        <w:t>Xem sản phẩm.</w:t>
+      </w:r>
+    </w:p>
+    <w:p>
+      <w:pPr>
+        <w:numPr>
+          <w:ilvl w:val="0"/>
+          <w:numId w:val="39"/>
+        </w:numPr>
+      </w:pPr>
+      <w:r>
+        <w:t>Quản lý giỏ hàng.</w:t>
+      </w:r>
+    </w:p>
+    <w:p>
+      <w:pPr>
+        <w:numPr>
+          <w:ilvl w:val="0"/>
+          <w:numId w:val="39"/>
+        </w:numPr>
+      </w:pPr>
+      <w:r>
+        <w:t>Đăng nhập và đăng ký.</w:t>
+      </w:r>
+    </w:p>
+    <w:p>
+      <w:pPr>
+        <w:numPr>
+          <w:ilvl w:val="0"/>
+          <w:numId w:val="39"/>
+        </w:numPr>
+      </w:pPr>
+      <w:r>
         <w:lastRenderedPageBreak/>
-        <w:t>Nhóm xử lý nghiệp vụ gồm Xử lý sản phẩm, Xử lý giỏ hàng, Xử lý đặt hàng và Xử lý tài khoản. Đây là nơi thực hiện các quy tắc như tính tiền hàng, tính phí giao hàng, kiểm tra điều kiện miễn phí giao hàng và ghi nhận đơn hàng.</w:t>
-      </w:r>
-    </w:p>
-    <w:p>
-      <w:r>
-        <w:t>Nhóm kết nối gồm Kết nối quản lý sản phẩm, Kết nối thanh toán và Kết nối thư điện tử. Mỗi lớp kết nối chỉ phụ trách trao đổi dữ liệu với một hệ thống bên ngoài.</w:t>
-      </w:r>
-    </w:p>
-    <w:p>
-      <w:r>
-        <w:t>Lớp Truy cập cơ sở dữ liệu thực hiện việc đọc và ghi dữ liệu khách hàng, đơn hàng và chi tiết đơn hàng. Cách tổ chức này giúp giao diện, nghiệp vụ và dữ liệu không phụ thuộc trực tiếp vào nhau.</w:t>
-      </w:r>
-    </w:p>
-    <w:p>
-      <w:r>
-        <w:t>2.7. Thiết kế theo chức năng</w:t>
-      </w:r>
-    </w:p>
-    <w:p>
-      <w:r>
-        <w:t>Mô hình thiết kế theo chức năng thể hiện cách các nhóm chức năng của e-SHOPPING được tổ chức trong chương trình.</w:t>
-      </w:r>
-    </w:p>
-    <w:p>
-      <w:r>
-        <w:t>Các chức năng giao diện gồm:</w:t>
-      </w:r>
-    </w:p>
-    <w:p>
-      <w:pPr>
-        <w:numPr>
-          <w:ilvl w:val="0"/>
-          <w:numId w:val="39"/>
-        </w:numPr>
-      </w:pPr>
-      <w:r>
-        <w:t>Xem sản phẩm.</w:t>
-      </w:r>
-    </w:p>
-    <w:p>
-      <w:pPr>
-        <w:numPr>
-          <w:ilvl w:val="0"/>
-          <w:numId w:val="39"/>
-        </w:numPr>
-      </w:pPr>
-      <w:r>
-        <w:t>Quản lý giỏ hàng.</w:t>
-      </w:r>
-    </w:p>
-    <w:p>
-      <w:pPr>
-        <w:numPr>
-          <w:ilvl w:val="0"/>
-          <w:numId w:val="39"/>
-        </w:numPr>
-      </w:pPr>
-      <w:r>
-        <w:t>Đăng nhập và đăng ký.</w:t>
-      </w:r>
-    </w:p>
-    <w:p>
-      <w:pPr>
-        <w:numPr>
-          <w:ilvl w:val="0"/>
-          <w:numId w:val="39"/>
-        </w:numPr>
-      </w:pPr>
-      <w:r>
         <w:t>Đặt hàng.</w:t>
       </w:r>
     </w:p>
@@ -4321,12 +4481,62 @@
       </w:r>
     </w:p>
     <w:p>
-      <w:r>
-        <w:t>[CHÈN SƠ ĐỒ THIẾT KẾ THEO CHỨC NĂNG TẠI ĐÂY]</w:t>
-      </w:r>
-    </w:p>
-    <w:p>
-      <w:r>
+      <w:pPr>
+        <w:spacing w:before="240" w:line="360" w:lineRule="auto"/>
+        <w:jc w:val="center"/>
+      </w:pPr>
+      <w:r>
+        <w:drawing>
+          <wp:inline distT="0" distB="0" distL="0" distR="0" wp14:anchorId="3D7B60DA" wp14:editId="3D08293C">
+            <wp:extent cx="5972175" cy="3230880"/>
+            <wp:effectExtent l="0" t="0" r="9525" b="7620"/>
+            <wp:docPr id="430182052" name="Picture 1"/>
+            <wp:cNvGraphicFramePr>
+              <a:graphicFrameLocks xmlns:a="http://schemas.openxmlformats.org/drawingml/2006/main" noChangeAspect="1"/>
+            </wp:cNvGraphicFramePr>
+            <a:graphic xmlns:a="http://schemas.openxmlformats.org/drawingml/2006/main">
+              <a:graphicData uri="http://schemas.openxmlformats.org/drawingml/2006/picture">
+                <pic:pic xmlns:pic="http://schemas.openxmlformats.org/drawingml/2006/picture">
+                  <pic:nvPicPr>
+                    <pic:cNvPr id="430182052" name=""/>
+                    <pic:cNvPicPr/>
+                  </pic:nvPicPr>
+                  <pic:blipFill>
+                    <a:blip r:embed="rId13"/>
+                    <a:stretch>
+                      <a:fillRect/>
+                    </a:stretch>
+                  </pic:blipFill>
+                  <pic:spPr>
+                    <a:xfrm>
+                      <a:off x="0" y="0"/>
+                      <a:ext cx="5972175" cy="3230880"/>
+                    </a:xfrm>
+                    <a:prstGeom prst="rect">
+                      <a:avLst/>
+                    </a:prstGeom>
+                  </pic:spPr>
+                </pic:pic>
+              </a:graphicData>
+            </a:graphic>
+          </wp:inline>
+        </w:drawing>
+      </w:r>
+    </w:p>
+    <w:p>
+      <w:pPr>
+        <w:spacing w:line="276" w:lineRule="auto"/>
+        <w:jc w:val="center"/>
+        <w:rPr>
+          <w:i/>
+          <w:iCs/>
+        </w:rPr>
+      </w:pPr>
+      <w:r>
+        <w:rPr>
+          <w:i/>
+          <w:iCs/>
+        </w:rPr>
         <w:t>Hình 2.8. Sơ đồ thiết kế theo chức năng của hệ thống e-SHOPPING</w:t>
       </w:r>
     </w:p>
@@ -4347,26 +4557,71 @@
     </w:p>
     <w:p>
       <w:r>
+        <w:t>Chức năng đặt hàng sử dụng bộ phận xử lý đặt hàng. Bộ phận này có thể kết nối với hệ thống quản lý sản phẩm, dịch vụ thanh toán trực tuyến, dịch vụ thư điện tử và cơ sở dữ liệu.</w:t>
+      </w:r>
+    </w:p>
+    <w:p>
+      <w:r>
+        <w:t>2.8. Mô hình hoạt động</w:t>
+      </w:r>
+    </w:p>
+    <w:p>
+      <w:r>
+        <w:t>Mô hình hoạt động mô tả toàn bộ luồng nghiệp vụ đặt hàng từ lúc khách hàng chọn sản phẩm đến khi đơn hàng được ghi nhận.</w:t>
+      </w:r>
+    </w:p>
+    <w:p>
+      <w:pPr>
+        <w:spacing w:before="240" w:line="360" w:lineRule="auto"/>
+        <w:jc w:val="center"/>
+        <w:rPr>
+          <w:lang w:val="vi-VN"/>
+        </w:rPr>
+      </w:pPr>
+      <w:r>
         <w:lastRenderedPageBreak/>
-        <w:t>Chức năng đặt hàng sử dụng bộ phận xử lý đặt hàng. Bộ phận này có thể kết nối với hệ thống quản lý sản phẩm, dịch vụ thanh toán trực tuyến, dịch vụ thư điện tử và cơ sở dữ liệu.</w:t>
-      </w:r>
-    </w:p>
-    <w:p>
-      <w:r>
-        <w:t>2.8. Mô hình hoạt động</w:t>
-      </w:r>
-    </w:p>
-    <w:p>
-      <w:r>
-        <w:t>Mô hình hoạt động mô tả toàn bộ luồng nghiệp vụ đặt hàng từ lúc khách hàng chọn sản phẩm đến khi đơn hàng được ghi nhận.</w:t>
-      </w:r>
-    </w:p>
-    <w:p>
-      <w:r>
-        <w:t>[CHÈN SƠ ĐỒ HOẠT ĐỘNG TẠI ĐÂY]</w:t>
-      </w:r>
-    </w:p>
-    <w:p>
+        <w:drawing>
+          <wp:inline distT="0" distB="0" distL="0" distR="0" wp14:anchorId="602DC466" wp14:editId="56D46308">
+            <wp:extent cx="5006774" cy="5006774"/>
+            <wp:effectExtent l="0" t="0" r="3810" b="3810"/>
+            <wp:docPr id="1334126409" name="Picture 1"/>
+            <wp:cNvGraphicFramePr>
+              <a:graphicFrameLocks xmlns:a="http://schemas.openxmlformats.org/drawingml/2006/main" noChangeAspect="1"/>
+            </wp:cNvGraphicFramePr>
+            <a:graphic xmlns:a="http://schemas.openxmlformats.org/drawingml/2006/main">
+              <a:graphicData uri="http://schemas.openxmlformats.org/drawingml/2006/picture">
+                <pic:pic xmlns:pic="http://schemas.openxmlformats.org/drawingml/2006/picture">
+                  <pic:nvPicPr>
+                    <pic:cNvPr id="1334126409" name=""/>
+                    <pic:cNvPicPr/>
+                  </pic:nvPicPr>
+                  <pic:blipFill>
+                    <a:blip r:embed="rId14"/>
+                    <a:stretch>
+                      <a:fillRect/>
+                    </a:stretch>
+                  </pic:blipFill>
+                  <pic:spPr>
+                    <a:xfrm>
+                      <a:off x="0" y="0"/>
+                      <a:ext cx="5006774" cy="5006774"/>
+                    </a:xfrm>
+                    <a:prstGeom prst="rect">
+                      <a:avLst/>
+                    </a:prstGeom>
+                  </pic:spPr>
+                </pic:pic>
+              </a:graphicData>
+            </a:graphic>
+          </wp:inline>
+        </w:drawing>
+      </w:r>
+    </w:p>
+    <w:p>
+      <w:pPr>
+        <w:spacing w:line="276" w:lineRule="auto"/>
+        <w:jc w:val="center"/>
+      </w:pPr>
       <w:r>
         <w:t>Hình 2.9. Sơ đồ hoạt động đặt hàng của hệ thống e-SHOPPING</w:t>
       </w:r>
@@ -4398,36 +4653,27 @@
     </w:p>
     <w:p>
       <w:r>
+        <w:lastRenderedPageBreak/>
         <w:t>Bảng 2.3. Đối chiếu nghiệp vụ giữa các mô hình UML</w:t>
       </w:r>
     </w:p>
     <w:tbl>
       <w:tblPr>
+        <w:tblStyle w:val="TableGrid"/>
         <w:tblW w:w="0" w:type="auto"/>
-        <w:tblCellSpacing w:w="15" w:type="dxa"/>
-        <w:tblCellMar>
-          <w:top w:w="15" w:type="dxa"/>
-          <w:left w:w="15" w:type="dxa"/>
-          <w:bottom w:w="15" w:type="dxa"/>
-          <w:right w:w="15" w:type="dxa"/>
-        </w:tblCellMar>
         <w:tblLook w:val="04A0" w:firstRow="1" w:lastRow="0" w:firstColumn="1" w:lastColumn="0" w:noHBand="0" w:noVBand="1"/>
       </w:tblPr>
       <w:tblGrid>
-        <w:gridCol w:w="2113"/>
-        <w:gridCol w:w="1828"/>
-        <w:gridCol w:w="2133"/>
-        <w:gridCol w:w="1191"/>
-        <w:gridCol w:w="2140"/>
+        <w:gridCol w:w="2086"/>
+        <w:gridCol w:w="1865"/>
+        <w:gridCol w:w="2098"/>
+        <w:gridCol w:w="1265"/>
+        <w:gridCol w:w="2081"/>
       </w:tblGrid>
       <w:tr>
-        <w:trPr>
-          <w:tblCellSpacing w:w="15" w:type="dxa"/>
-        </w:trPr>
         <w:tc>
           <w:tcPr>
             <w:tcW w:w="0" w:type="auto"/>
-            <w:vAlign w:val="center"/>
             <w:hideMark/>
           </w:tcPr>
           <w:p>
@@ -4449,7 +4695,6 @@
         <w:tc>
           <w:tcPr>
             <w:tcW w:w="0" w:type="auto"/>
-            <w:vAlign w:val="center"/>
             <w:hideMark/>
           </w:tcPr>
           <w:p>
@@ -4471,7 +4716,6 @@
         <w:tc>
           <w:tcPr>
             <w:tcW w:w="0" w:type="auto"/>
-            <w:vAlign w:val="center"/>
             <w:hideMark/>
           </w:tcPr>
           <w:p>
@@ -4493,7 +4737,6 @@
         <w:tc>
           <w:tcPr>
             <w:tcW w:w="0" w:type="auto"/>
-            <w:vAlign w:val="center"/>
             <w:hideMark/>
           </w:tcPr>
           <w:p>
@@ -4515,7 +4758,6 @@
         <w:tc>
           <w:tcPr>
             <w:tcW w:w="0" w:type="auto"/>
-            <w:vAlign w:val="center"/>
             <w:hideMark/>
           </w:tcPr>
           <w:p>
@@ -4536,13 +4778,9 @@
         </w:tc>
       </w:tr>
       <w:tr>
-        <w:trPr>
-          <w:tblCellSpacing w:w="15" w:type="dxa"/>
-        </w:trPr>
         <w:tc>
           <w:tcPr>
             <w:tcW w:w="0" w:type="auto"/>
-            <w:vAlign w:val="center"/>
             <w:hideMark/>
           </w:tcPr>
           <w:p>
@@ -4554,7 +4792,6 @@
         <w:tc>
           <w:tcPr>
             <w:tcW w:w="0" w:type="auto"/>
-            <w:vAlign w:val="center"/>
             <w:hideMark/>
           </w:tcPr>
           <w:p>
@@ -4566,7 +4803,6 @@
         <w:tc>
           <w:tcPr>
             <w:tcW w:w="0" w:type="auto"/>
-            <w:vAlign w:val="center"/>
             <w:hideMark/>
           </w:tcPr>
           <w:p>
@@ -4578,7 +4814,6 @@
         <w:tc>
           <w:tcPr>
             <w:tcW w:w="0" w:type="auto"/>
-            <w:vAlign w:val="center"/>
             <w:hideMark/>
           </w:tcPr>
           <w:p>
@@ -4590,7 +4825,6 @@
         <w:tc>
           <w:tcPr>
             <w:tcW w:w="0" w:type="auto"/>
-            <w:vAlign w:val="center"/>
             <w:hideMark/>
           </w:tcPr>
           <w:p>
@@ -4601,13 +4835,9 @@
         </w:tc>
       </w:tr>
       <w:tr>
-        <w:trPr>
-          <w:tblCellSpacing w:w="15" w:type="dxa"/>
-        </w:trPr>
         <w:tc>
           <w:tcPr>
             <w:tcW w:w="0" w:type="auto"/>
-            <w:vAlign w:val="center"/>
             <w:hideMark/>
           </w:tcPr>
           <w:p>
@@ -4619,7 +4849,6 @@
         <w:tc>
           <w:tcPr>
             <w:tcW w:w="0" w:type="auto"/>
-            <w:vAlign w:val="center"/>
             <w:hideMark/>
           </w:tcPr>
           <w:p>
@@ -4631,7 +4860,6 @@
         <w:tc>
           <w:tcPr>
             <w:tcW w:w="0" w:type="auto"/>
-            <w:vAlign w:val="center"/>
             <w:hideMark/>
           </w:tcPr>
           <w:p>
@@ -4643,7 +4871,6 @@
         <w:tc>
           <w:tcPr>
             <w:tcW w:w="0" w:type="auto"/>
-            <w:vAlign w:val="center"/>
             <w:hideMark/>
           </w:tcPr>
           <w:p>
@@ -4655,7 +4882,6 @@
         <w:tc>
           <w:tcPr>
             <w:tcW w:w="0" w:type="auto"/>
-            <w:vAlign w:val="center"/>
             <w:hideMark/>
           </w:tcPr>
           <w:p>
@@ -4666,13 +4892,9 @@
         </w:tc>
       </w:tr>
       <w:tr>
-        <w:trPr>
-          <w:tblCellSpacing w:w="15" w:type="dxa"/>
-        </w:trPr>
         <w:tc>
           <w:tcPr>
             <w:tcW w:w="0" w:type="auto"/>
-            <w:vAlign w:val="center"/>
             <w:hideMark/>
           </w:tcPr>
           <w:p>
@@ -4684,7 +4906,6 @@
         <w:tc>
           <w:tcPr>
             <w:tcW w:w="0" w:type="auto"/>
-            <w:vAlign w:val="center"/>
             <w:hideMark/>
           </w:tcPr>
           <w:p>
@@ -4696,7 +4917,6 @@
         <w:tc>
           <w:tcPr>
             <w:tcW w:w="0" w:type="auto"/>
-            <w:vAlign w:val="center"/>
             <w:hideMark/>
           </w:tcPr>
           <w:p>
@@ -4708,7 +4928,6 @@
         <w:tc>
           <w:tcPr>
             <w:tcW w:w="0" w:type="auto"/>
-            <w:vAlign w:val="center"/>
             <w:hideMark/>
           </w:tcPr>
           <w:p>
@@ -4720,7 +4939,6 @@
         <w:tc>
           <w:tcPr>
             <w:tcW w:w="0" w:type="auto"/>
-            <w:vAlign w:val="center"/>
             <w:hideMark/>
           </w:tcPr>
           <w:p>
@@ -4731,18 +4949,13 @@
         </w:tc>
       </w:tr>
       <w:tr>
-        <w:trPr>
-          <w:tblCellSpacing w:w="15" w:type="dxa"/>
-        </w:trPr>
         <w:tc>
           <w:tcPr>
             <w:tcW w:w="0" w:type="auto"/>
-            <w:vAlign w:val="center"/>
             <w:hideMark/>
           </w:tcPr>
           <w:p>
             <w:r>
-              <w:lastRenderedPageBreak/>
               <w:t>Đặt hàng</w:t>
             </w:r>
           </w:p>
@@ -4750,7 +4963,6 @@
         <w:tc>
           <w:tcPr>
             <w:tcW w:w="0" w:type="auto"/>
-            <w:vAlign w:val="center"/>
             <w:hideMark/>
           </w:tcPr>
           <w:p>
@@ -4762,7 +4974,6 @@
         <w:tc>
           <w:tcPr>
             <w:tcW w:w="0" w:type="auto"/>
-            <w:vAlign w:val="center"/>
             <w:hideMark/>
           </w:tcPr>
           <w:p>
@@ -4774,7 +4985,6 @@
         <w:tc>
           <w:tcPr>
             <w:tcW w:w="0" w:type="auto"/>
-            <w:vAlign w:val="center"/>
             <w:hideMark/>
           </w:tcPr>
           <w:p>
@@ -4786,7 +4996,6 @@
         <w:tc>
           <w:tcPr>
             <w:tcW w:w="0" w:type="auto"/>
-            <w:vAlign w:val="center"/>
             <w:hideMark/>
           </w:tcPr>
           <w:p>
@@ -4797,13 +5006,9 @@
         </w:tc>
       </w:tr>
       <w:tr>
-        <w:trPr>
-          <w:tblCellSpacing w:w="15" w:type="dxa"/>
-        </w:trPr>
         <w:tc>
           <w:tcPr>
             <w:tcW w:w="0" w:type="auto"/>
-            <w:vAlign w:val="center"/>
             <w:hideMark/>
           </w:tcPr>
           <w:p>
@@ -4815,7 +5020,6 @@
         <w:tc>
           <w:tcPr>
             <w:tcW w:w="0" w:type="auto"/>
-            <w:vAlign w:val="center"/>
             <w:hideMark/>
           </w:tcPr>
           <w:p>
@@ -4827,7 +5031,6 @@
         <w:tc>
           <w:tcPr>
             <w:tcW w:w="0" w:type="auto"/>
-            <w:vAlign w:val="center"/>
             <w:hideMark/>
           </w:tcPr>
           <w:p>
@@ -4839,7 +5042,6 @@
         <w:tc>
           <w:tcPr>
             <w:tcW w:w="0" w:type="auto"/>
-            <w:vAlign w:val="center"/>
             <w:hideMark/>
           </w:tcPr>
           <w:p>
@@ -4851,7 +5053,6 @@
         <w:tc>
           <w:tcPr>
             <w:tcW w:w="0" w:type="auto"/>
-            <w:vAlign w:val="center"/>
             <w:hideMark/>
           </w:tcPr>
           <w:p>
@@ -4862,13 +5063,9 @@
         </w:tc>
       </w:tr>
       <w:tr>
-        <w:trPr>
-          <w:tblCellSpacing w:w="15" w:type="dxa"/>
-        </w:trPr>
         <w:tc>
           <w:tcPr>
             <w:tcW w:w="0" w:type="auto"/>
-            <w:vAlign w:val="center"/>
             <w:hideMark/>
           </w:tcPr>
           <w:p>
@@ -4880,7 +5077,6 @@
         <w:tc>
           <w:tcPr>
             <w:tcW w:w="0" w:type="auto"/>
-            <w:vAlign w:val="center"/>
             <w:hideMark/>
           </w:tcPr>
           <w:p>
@@ -4892,7 +5088,6 @@
         <w:tc>
           <w:tcPr>
             <w:tcW w:w="0" w:type="auto"/>
-            <w:vAlign w:val="center"/>
             <w:hideMark/>
           </w:tcPr>
           <w:p>
@@ -4904,7 +5099,6 @@
         <w:tc>
           <w:tcPr>
             <w:tcW w:w="0" w:type="auto"/>
-            <w:vAlign w:val="center"/>
             <w:hideMark/>
           </w:tcPr>
           <w:p>
@@ -4916,7 +5110,6 @@
         <w:tc>
           <w:tcPr>
             <w:tcW w:w="0" w:type="auto"/>
-            <w:vAlign w:val="center"/>
             <w:hideMark/>
           </w:tcPr>
           <w:p>
@@ -4927,13 +5120,9 @@
         </w:tc>
       </w:tr>
       <w:tr>
-        <w:trPr>
-          <w:tblCellSpacing w:w="15" w:type="dxa"/>
-        </w:trPr>
         <w:tc>
           <w:tcPr>
             <w:tcW w:w="0" w:type="auto"/>
-            <w:vAlign w:val="center"/>
             <w:hideMark/>
           </w:tcPr>
           <w:p>
@@ -4945,7 +5134,6 @@
         <w:tc>
           <w:tcPr>
             <w:tcW w:w="0" w:type="auto"/>
-            <w:vAlign w:val="center"/>
             <w:hideMark/>
           </w:tcPr>
           <w:p>
@@ -4957,7 +5145,6 @@
         <w:tc>
           <w:tcPr>
             <w:tcW w:w="0" w:type="auto"/>
-            <w:vAlign w:val="center"/>
             <w:hideMark/>
           </w:tcPr>
           <w:p>
@@ -4969,7 +5156,6 @@
         <w:tc>
           <w:tcPr>
             <w:tcW w:w="0" w:type="auto"/>
-            <w:vAlign w:val="center"/>
             <w:hideMark/>
           </w:tcPr>
           <w:p>
@@ -4981,7 +5167,6 @@
         <w:tc>
           <w:tcPr>
             <w:tcW w:w="0" w:type="auto"/>
-            <w:vAlign w:val="center"/>
             <w:hideMark/>
           </w:tcPr>
           <w:p>
@@ -5003,7 +5188,18 @@
       </w:r>
     </w:p>
     <w:p>
-      <w:r>
+      <w:pPr>
+        <w:jc w:val="center"/>
+        <w:rPr>
+          <w:b/>
+          <w:bCs/>
+        </w:rPr>
+      </w:pPr>
+      <w:r>
+        <w:rPr>
+          <w:b/>
+          <w:bCs/>
+        </w:rPr>
         <w:t>2.10. Kết luận</w:t>
       </w:r>
     </w:p>
@@ -11102,6 +11298,7 @@
   <w:style w:type="character" w:default="1" w:styleId="DefaultParagraphFont">
     <w:name w:val="Default Paragraph Font"/>
     <w:uiPriority w:val="1"/>
+    <w:semiHidden/>
     <w:unhideWhenUsed/>
   </w:style>
   <w:style w:type="table" w:default="1" w:styleId="TableNormal">

</xml_diff>